<commit_message>
Revise Results: analytic commentary after each quotation, theme descriptions table, remove redundant incident table, strengthen anonymity
Co-Authored-By: Claude Opus 5.5 <noreply@anthropic.com>
Claude-Session: https://claude.ai/code/session_01UT78gMGbZSf9MGjAKTYAmX
</commit_message>
<xml_diff>
--- a/docs/revision_R2/Findings_Section.docx
+++ b/docs/revision_R2/Findings_Section.docx
@@ -1323,7 +1323,7 @@
         <w:rPr>
           <w:b w:val="0"/>
         </w:rPr>
-        <w:t>Nineteen managers described a recent occasion when a nurse raised a concern while, by their account, the unit’s routinely reported indicators appeared satisfactory (Table 2). Two described concerns raised when indicators were unfavourable or were not referred to, and two described their usual practice without a specific incident. These four accounts contributed to findings on general expectations and organisational conditions (Sections 3.5.3 and 3.7) but not to findings about judgements in qualifying situations.</w:t>
+        <w:t>Nineteen managers described a recent occasion when a nurse raised a concern while, by their account, the unit’s routinely reported indicators appeared satisfactory. Two described concerns raised when indicators were unfavourable or were not referred to, and two described their usual practice without a specific incident. These four accounts contributed to findings on anticipated evidential demands and organisational conditions (Sections 3.5.3 and 3.7), but not to findings about judgements in qualifying situations.</w:t>
       </w:r>
     </w:p>
     <w:p>
@@ -1331,561 +1331,9 @@
         <w:rPr>
           <w:b w:val="0"/>
         </w:rPr>
-        <w:t>In the 19 qualifying accounts, managers referred most often to falls (n = 8) and hospital-acquired pressure injuries (n = 6), followed by patient-experience scores (n = 3) and medication-administration incidents (n = 2). The concerns related to staffing or skill mix (n = 7), missed or delayed care (n = 6), patient deterioration or clinical monitoring (n = 3) and clinical practice or communication (n = 3). In 15 accounts, the indicator the manager cited did not measure the aspect or period of care to which the concern related. In the remaining four, the indicator and the concern addressed the same domain.</w:t>
+        <w:t>In the 19 qualifying accounts, managers referred most often to falls (n = 8) and hospital-acquired pressure injuries (n = 6), followed by patient-experience scores (n = 3) and medication-administration incidents (n = 2). The concerns related to staffing or skill mix (n = 7), missed or delayed care (n = 6), patient deterioration or clinical monitoring (n = 3) and clinical practice or communication (n = 3). In 15 accounts, the indicator the manager cited did not measure the aspect or period of care to which the concern related; in the remaining four, the indicator and the concern addressed the same domain. These counts describe the accounts analysed and are not used to represent the frequency of such situations in practice.</w:t>
       </w:r>
     </w:p>
-    <w:p>
-      <w:r>
-        <w:rPr>
-          <w:b/>
-        </w:rPr>
-        <w:t>Table 2. Classification of incident accounts and indicators referred to (N = 23)</w:t>
-      </w:r>
-    </w:p>
-    <w:tbl>
-      <w:tblPr>
-        <w:tblStyle w:val="TableGrid"/>
-        <w:tblW w:type="auto" w:w="0"/>
-        <w:tblLayout w:type="fixed"/>
-        <w:tblLook w:firstColumn="1" w:firstRow="1" w:lastColumn="0" w:lastRow="0" w:noHBand="0" w:noVBand="1" w:val="04A0"/>
-      </w:tblPr>
-      <w:tblGrid>
-        <w:gridCol w:w="4320"/>
-        <w:gridCol w:w="720"/>
-        <w:gridCol w:w="4176"/>
-      </w:tblGrid>
-      <w:tr>
-        <w:tc>
-          <w:tcPr>
-            <w:tcW w:type="dxa" w:w="4320"/>
-            <w:shd w:val="clear" w:color="auto" w:fill="D9E2F3"/>
-          </w:tcPr>
-          <w:p>
-            <w:r/>
-            <w:r>
-              <w:rPr>
-                <w:b/>
-                <w:sz w:val="19"/>
-              </w:rPr>
-              <w:t>Classification</w:t>
-            </w:r>
-          </w:p>
-        </w:tc>
-        <w:tc>
-          <w:tcPr>
-            <w:tcW w:type="dxa" w:w="720"/>
-            <w:shd w:val="clear" w:color="auto" w:fill="D9E2F3"/>
-          </w:tcPr>
-          <w:p>
-            <w:r/>
-            <w:r>
-              <w:rPr>
-                <w:b/>
-                <w:sz w:val="19"/>
-              </w:rPr>
-              <w:t>n</w:t>
-            </w:r>
-          </w:p>
-        </w:tc>
-        <w:tc>
-          <w:tcPr>
-            <w:tcW w:type="dxa" w:w="4176"/>
-            <w:shd w:val="clear" w:color="auto" w:fill="D9E2F3"/>
-          </w:tcPr>
-          <w:p>
-            <w:r/>
-            <w:r>
-              <w:rPr>
-                <w:b/>
-                <w:sz w:val="19"/>
-              </w:rPr>
-              <w:t>Participants</w:t>
-            </w:r>
-          </w:p>
-        </w:tc>
-      </w:tr>
-      <w:tr>
-        <w:tc>
-          <w:tcPr>
-            <w:tcW w:type="dxa" w:w="4176"/>
-            <w:gridSpan w:val="3"/>
-            <w:shd w:val="clear" w:color="auto" w:fill="F2F2F2"/>
-          </w:tcPr>
-          <w:p>
-            <w:r/>
-            <w:r>
-              <w:rPr>
-                <w:b/>
-                <w:sz w:val="19"/>
-              </w:rPr>
-              <w:t>Account category</w:t>
-            </w:r>
-          </w:p>
-        </w:tc>
-      </w:tr>
-      <w:tr>
-        <w:tc>
-          <w:tcPr>
-            <w:tcW w:type="dxa" w:w="4320"/>
-          </w:tcPr>
-          <w:p>
-            <w:r/>
-            <w:r>
-              <w:rPr>
-                <w:sz w:val="19"/>
-              </w:rPr>
-              <w:t>(a) Concern raised while indicators appeared satisfactory</w:t>
-            </w:r>
-          </w:p>
-        </w:tc>
-        <w:tc>
-          <w:tcPr>
-            <w:tcW w:type="dxa" w:w="720"/>
-          </w:tcPr>
-          <w:p>
-            <w:pPr>
-              <w:jc w:val="center"/>
-            </w:pPr>
-            <w:r/>
-            <w:r>
-              <w:rPr>
-                <w:sz w:val="19"/>
-              </w:rPr>
-              <w:t>19</w:t>
-            </w:r>
-          </w:p>
-        </w:tc>
-        <w:tc>
-          <w:tcPr>
-            <w:tcW w:type="dxa" w:w="4176"/>
-          </w:tcPr>
-          <w:p>
-            <w:r/>
-            <w:r>
-              <w:rPr>
-                <w:sz w:val="19"/>
-              </w:rPr>
-              <w:t>P01, P02, P03, P04, P05, P06, P07, P08, P10, P11, P12, P13, P15, P16, P17, P18, P19, P21, P23</w:t>
-            </w:r>
-          </w:p>
-        </w:tc>
-      </w:tr>
-      <w:tr>
-        <w:tc>
-          <w:tcPr>
-            <w:tcW w:type="dxa" w:w="4320"/>
-          </w:tcPr>
-          <w:p>
-            <w:r/>
-            <w:r>
-              <w:rPr>
-                <w:sz w:val="19"/>
-              </w:rPr>
-              <w:t>(b) Concern raised in other circumstances</w:t>
-            </w:r>
-          </w:p>
-        </w:tc>
-        <w:tc>
-          <w:tcPr>
-            <w:tcW w:type="dxa" w:w="720"/>
-          </w:tcPr>
-          <w:p>
-            <w:pPr>
-              <w:jc w:val="center"/>
-            </w:pPr>
-            <w:r/>
-            <w:r>
-              <w:rPr>
-                <w:sz w:val="19"/>
-              </w:rPr>
-              <w:t>2</w:t>
-            </w:r>
-          </w:p>
-        </w:tc>
-        <w:tc>
-          <w:tcPr>
-            <w:tcW w:type="dxa" w:w="4176"/>
-          </w:tcPr>
-          <w:p>
-            <w:r/>
-            <w:r>
-              <w:rPr>
-                <w:sz w:val="19"/>
-              </w:rPr>
-              <w:t>P14, P20</w:t>
-            </w:r>
-          </w:p>
-        </w:tc>
-      </w:tr>
-      <w:tr>
-        <w:tc>
-          <w:tcPr>
-            <w:tcW w:type="dxa" w:w="4320"/>
-          </w:tcPr>
-          <w:p>
-            <w:r/>
-            <w:r>
-              <w:rPr>
-                <w:sz w:val="19"/>
-              </w:rPr>
-              <w:t>(c) Usual practice, no specific incident</w:t>
-            </w:r>
-          </w:p>
-        </w:tc>
-        <w:tc>
-          <w:tcPr>
-            <w:tcW w:type="dxa" w:w="720"/>
-          </w:tcPr>
-          <w:p>
-            <w:pPr>
-              <w:jc w:val="center"/>
-            </w:pPr>
-            <w:r/>
-            <w:r>
-              <w:rPr>
-                <w:sz w:val="19"/>
-              </w:rPr>
-              <w:t>2</w:t>
-            </w:r>
-          </w:p>
-        </w:tc>
-        <w:tc>
-          <w:tcPr>
-            <w:tcW w:type="dxa" w:w="4176"/>
-          </w:tcPr>
-          <w:p>
-            <w:r/>
-            <w:r>
-              <w:rPr>
-                <w:sz w:val="19"/>
-              </w:rPr>
-              <w:t>P09, P22</w:t>
-            </w:r>
-          </w:p>
-        </w:tc>
-      </w:tr>
-      <w:tr>
-        <w:tc>
-          <w:tcPr>
-            <w:tcW w:type="dxa" w:w="4176"/>
-            <w:gridSpan w:val="3"/>
-            <w:shd w:val="clear" w:color="auto" w:fill="F2F2F2"/>
-          </w:tcPr>
-          <w:p>
-            <w:r/>
-            <w:r>
-              <w:rPr>
-                <w:b/>
-                <w:sz w:val="19"/>
-              </w:rPr>
-              <w:t>Indicator referred to in qualifying accounts (n = 19)</w:t>
-            </w:r>
-          </w:p>
-        </w:tc>
-      </w:tr>
-      <w:tr>
-        <w:tc>
-          <w:tcPr>
-            <w:tcW w:type="dxa" w:w="4320"/>
-          </w:tcPr>
-          <w:p>
-            <w:r/>
-            <w:r>
-              <w:rPr>
-                <w:sz w:val="19"/>
-              </w:rPr>
-              <w:t>Falls</w:t>
-            </w:r>
-          </w:p>
-        </w:tc>
-        <w:tc>
-          <w:tcPr>
-            <w:tcW w:type="dxa" w:w="720"/>
-          </w:tcPr>
-          <w:p>
-            <w:pPr>
-              <w:jc w:val="center"/>
-            </w:pPr>
-            <w:r/>
-            <w:r>
-              <w:rPr>
-                <w:sz w:val="19"/>
-              </w:rPr>
-              <w:t>8</w:t>
-            </w:r>
-          </w:p>
-        </w:tc>
-        <w:tc>
-          <w:tcPr>
-            <w:tcW w:type="dxa" w:w="4176"/>
-          </w:tcPr>
-          <w:p>
-            <w:r/>
-            <w:r>
-              <w:rPr>
-                <w:sz w:val="19"/>
-              </w:rPr>
-              <w:t>P01, P05, P06, P10, P13, P15, P17, P23</w:t>
-            </w:r>
-          </w:p>
-        </w:tc>
-      </w:tr>
-      <w:tr>
-        <w:tc>
-          <w:tcPr>
-            <w:tcW w:type="dxa" w:w="4320"/>
-          </w:tcPr>
-          <w:p>
-            <w:r/>
-            <w:r>
-              <w:rPr>
-                <w:sz w:val="19"/>
-              </w:rPr>
-              <w:t>Hospital-acquired pressure injuries</w:t>
-            </w:r>
-          </w:p>
-        </w:tc>
-        <w:tc>
-          <w:tcPr>
-            <w:tcW w:type="dxa" w:w="720"/>
-          </w:tcPr>
-          <w:p>
-            <w:pPr>
-              <w:jc w:val="center"/>
-            </w:pPr>
-            <w:r/>
-            <w:r>
-              <w:rPr>
-                <w:sz w:val="19"/>
-              </w:rPr>
-              <w:t>6</w:t>
-            </w:r>
-          </w:p>
-        </w:tc>
-        <w:tc>
-          <w:tcPr>
-            <w:tcW w:type="dxa" w:w="4176"/>
-          </w:tcPr>
-          <w:p>
-            <w:r/>
-            <w:r>
-              <w:rPr>
-                <w:sz w:val="19"/>
-              </w:rPr>
-              <w:t>P02, P07, P12, P16, P18, P21</w:t>
-            </w:r>
-          </w:p>
-        </w:tc>
-      </w:tr>
-      <w:tr>
-        <w:tc>
-          <w:tcPr>
-            <w:tcW w:type="dxa" w:w="4320"/>
-          </w:tcPr>
-          <w:p>
-            <w:r/>
-            <w:r>
-              <w:rPr>
-                <w:sz w:val="19"/>
-              </w:rPr>
-              <w:t>Patient-experience scores</w:t>
-            </w:r>
-          </w:p>
-        </w:tc>
-        <w:tc>
-          <w:tcPr>
-            <w:tcW w:type="dxa" w:w="720"/>
-          </w:tcPr>
-          <w:p>
-            <w:pPr>
-              <w:jc w:val="center"/>
-            </w:pPr>
-            <w:r/>
-            <w:r>
-              <w:rPr>
-                <w:sz w:val="19"/>
-              </w:rPr>
-              <w:t>3</w:t>
-            </w:r>
-          </w:p>
-        </w:tc>
-        <w:tc>
-          <w:tcPr>
-            <w:tcW w:type="dxa" w:w="4176"/>
-          </w:tcPr>
-          <w:p>
-            <w:r/>
-            <w:r>
-              <w:rPr>
-                <w:sz w:val="19"/>
-              </w:rPr>
-              <w:t>P04, P11, P19</w:t>
-            </w:r>
-          </w:p>
-        </w:tc>
-      </w:tr>
-      <w:tr>
-        <w:tc>
-          <w:tcPr>
-            <w:tcW w:type="dxa" w:w="4320"/>
-          </w:tcPr>
-          <w:p>
-            <w:r/>
-            <w:r>
-              <w:rPr>
-                <w:sz w:val="19"/>
-              </w:rPr>
-              <w:t>Medication-administration incidents</w:t>
-            </w:r>
-          </w:p>
-        </w:tc>
-        <w:tc>
-          <w:tcPr>
-            <w:tcW w:type="dxa" w:w="720"/>
-          </w:tcPr>
-          <w:p>
-            <w:pPr>
-              <w:jc w:val="center"/>
-            </w:pPr>
-            <w:r/>
-            <w:r>
-              <w:rPr>
-                <w:sz w:val="19"/>
-              </w:rPr>
-              <w:t>2</w:t>
-            </w:r>
-          </w:p>
-        </w:tc>
-        <w:tc>
-          <w:tcPr>
-            <w:tcW w:type="dxa" w:w="4176"/>
-          </w:tcPr>
-          <w:p>
-            <w:r/>
-            <w:r>
-              <w:rPr>
-                <w:sz w:val="19"/>
-              </w:rPr>
-              <w:t>P03, P08</w:t>
-            </w:r>
-          </w:p>
-        </w:tc>
-      </w:tr>
-      <w:tr>
-        <w:tc>
-          <w:tcPr>
-            <w:tcW w:type="dxa" w:w="4176"/>
-            <w:gridSpan w:val="3"/>
-            <w:shd w:val="clear" w:color="auto" w:fill="F2F2F2"/>
-          </w:tcPr>
-          <w:p>
-            <w:r/>
-            <w:r>
-              <w:rPr>
-                <w:b/>
-                <w:sz w:val="19"/>
-              </w:rPr>
-              <w:t>Correspondence between indicator and concern (n = 19)</w:t>
-            </w:r>
-          </w:p>
-        </w:tc>
-      </w:tr>
-      <w:tr>
-        <w:tc>
-          <w:tcPr>
-            <w:tcW w:type="dxa" w:w="4320"/>
-          </w:tcPr>
-          <w:p>
-            <w:r/>
-            <w:r>
-              <w:rPr>
-                <w:sz w:val="19"/>
-              </w:rPr>
-              <w:t>Indicator did not measure the aspect or period of care concerned</w:t>
-            </w:r>
-          </w:p>
-        </w:tc>
-        <w:tc>
-          <w:tcPr>
-            <w:tcW w:type="dxa" w:w="720"/>
-          </w:tcPr>
-          <w:p>
-            <w:pPr>
-              <w:jc w:val="center"/>
-            </w:pPr>
-            <w:r/>
-            <w:r>
-              <w:rPr>
-                <w:sz w:val="19"/>
-              </w:rPr>
-              <w:t>15</w:t>
-            </w:r>
-          </w:p>
-        </w:tc>
-        <w:tc>
-          <w:tcPr>
-            <w:tcW w:type="dxa" w:w="4176"/>
-          </w:tcPr>
-          <w:p>
-            <w:r/>
-            <w:r>
-              <w:rPr>
-                <w:sz w:val="19"/>
-              </w:rPr>
-              <w:t>P01, P02, P04, P05, P06, P08, P10, P11, P12, P15, P16, P17, P18, P21, P23</w:t>
-            </w:r>
-          </w:p>
-        </w:tc>
-      </w:tr>
-      <w:tr>
-        <w:tc>
-          <w:tcPr>
-            <w:tcW w:type="dxa" w:w="4320"/>
-          </w:tcPr>
-          <w:p>
-            <w:r/>
-            <w:r>
-              <w:rPr>
-                <w:sz w:val="19"/>
-              </w:rPr>
-              <w:t>Indicator addressed the same domain as the concern</w:t>
-            </w:r>
-          </w:p>
-        </w:tc>
-        <w:tc>
-          <w:tcPr>
-            <w:tcW w:type="dxa" w:w="720"/>
-          </w:tcPr>
-          <w:p>
-            <w:pPr>
-              <w:jc w:val="center"/>
-            </w:pPr>
-            <w:r/>
-            <w:r>
-              <w:rPr>
-                <w:sz w:val="19"/>
-              </w:rPr>
-              <w:t>4</w:t>
-            </w:r>
-          </w:p>
-        </w:tc>
-        <w:tc>
-          <w:tcPr>
-            <w:tcW w:type="dxa" w:w="4176"/>
-          </w:tcPr>
-          <w:p>
-            <w:r/>
-            <w:r>
-              <w:rPr>
-                <w:sz w:val="19"/>
-              </w:rPr>
-              <w:t>P03, P07, P13, P19</w:t>
-            </w:r>
-          </w:p>
-        </w:tc>
-      </w:tr>
-    </w:tbl>
-    <w:p/>
     <w:p>
       <w:pPr>
         <w:pStyle w:val="Heading2"/>
@@ -1899,7 +1347,15 @@
         <w:rPr>
           <w:b w:val="0"/>
         </w:rPr>
-        <w:t>Four themes describe how managers judged and responded to nurses’ concerns when indicators appeared reassuring (Table 3). Managers first weighed concerns against a presumption of safety created by satisfactory indicators (Theme 1). They then decided who should establish that a concern warranted action (Theme 2), and responded through local adjustment, negotiated escalation and largely informal feedback (Theme 3). Organisational arrangements shaped each of these steps (Theme 4). Quotations are attributed by participant and hospital code; † indicates a quotation translated from Arabic.</w:t>
+        <w:t>Four themes describe how managers judged and responded to nurses’ concerns when indicators appeared reassuring (Table 2). Managers first weighed concerns against a presumption of safety created by satisfactory indicators (Theme 1). They then decided who should establish that a concern warranted action (Theme 2), and responded through local adjustment, negotiated escalation and largely informal feedback (Theme 3). Organisational arrangements shaped each of these steps (Theme 4).</w:t>
+      </w:r>
+    </w:p>
+    <w:p>
+      <w:r>
+        <w:rPr>
+          <w:b w:val="0"/>
+        </w:rPr>
+        <w:t>Quotations are attributed by participant and hospital code; † indicates a quotation translated from Arabic. Words in square brackets were added to clarify meaning or replaced to protect anonymity.</w:t>
       </w:r>
     </w:p>
     <w:p>
@@ -1907,7 +1363,7 @@
         <w:rPr>
           <w:b/>
         </w:rPr>
-        <w:t>Table 3. Themes, subthemes and corresponding study objectives</w:t>
+        <w:t>Table 2. Themes, subthemes, descriptions and corresponding study objectives</w:t>
       </w:r>
     </w:p>
     <w:tbl>
@@ -1918,14 +1374,15 @@
         <w:tblLook w:firstColumn="1" w:firstRow="1" w:lastColumn="0" w:lastRow="0" w:noHBand="0" w:noVBand="1" w:val="04A0"/>
       </w:tblPr>
       <w:tblGrid>
-        <w:gridCol w:w="2880"/>
-        <w:gridCol w:w="5328"/>
-        <w:gridCol w:w="1152"/>
+        <w:gridCol w:w="1872"/>
+        <w:gridCol w:w="2736"/>
+        <w:gridCol w:w="3960"/>
+        <w:gridCol w:w="1080"/>
       </w:tblGrid>
       <w:tr>
         <w:tc>
           <w:tcPr>
-            <w:tcW w:type="dxa" w:w="2880"/>
+            <w:tcW w:type="dxa" w:w="1872"/>
             <w:shd w:val="clear" w:color="auto" w:fill="D9E2F3"/>
           </w:tcPr>
           <w:p>
@@ -1941,7 +1398,7 @@
         </w:tc>
         <w:tc>
           <w:tcPr>
-            <w:tcW w:type="dxa" w:w="5328"/>
+            <w:tcW w:type="dxa" w:w="2736"/>
             <w:shd w:val="clear" w:color="auto" w:fill="D9E2F3"/>
           </w:tcPr>
           <w:p>
@@ -1957,7 +1414,23 @@
         </w:tc>
         <w:tc>
           <w:tcPr>
-            <w:tcW w:type="dxa" w:w="1152"/>
+            <w:tcW w:type="dxa" w:w="3960"/>
+            <w:shd w:val="clear" w:color="auto" w:fill="D9E2F3"/>
+          </w:tcPr>
+          <w:p>
+            <w:r/>
+            <w:r>
+              <w:rPr>
+                <w:b/>
+                <w:sz w:val="19"/>
+              </w:rPr>
+              <w:t>Description</w:t>
+            </w:r>
+          </w:p>
+        </w:tc>
+        <w:tc>
+          <w:tcPr>
+            <w:tcW w:type="dxa" w:w="1080"/>
             <w:shd w:val="clear" w:color="auto" w:fill="D9E2F3"/>
           </w:tcPr>
           <w:p>
@@ -1975,7 +1448,7 @@
       <w:tr>
         <w:tc>
           <w:tcPr>
-            <w:tcW w:type="dxa" w:w="2880"/>
+            <w:tcW w:type="dxa" w:w="1872"/>
             <w:vMerge w:val="restart"/>
           </w:tcPr>
           <w:p>
@@ -1990,7 +1463,7 @@
         </w:tc>
         <w:tc>
           <w:tcPr>
-            <w:tcW w:type="dxa" w:w="5328"/>
+            <w:tcW w:type="dxa" w:w="2736"/>
           </w:tcPr>
           <w:p>
             <w:r/>
@@ -2004,7 +1477,21 @@
         </w:tc>
         <w:tc>
           <w:tcPr>
-            <w:tcW w:type="dxa" w:w="1152"/>
+            <w:tcW w:type="dxa" w:w="3960"/>
+          </w:tcPr>
+          <w:p>
+            <w:r/>
+            <w:r>
+              <w:rPr>
+                <w:sz w:val="19"/>
+              </w:rPr>
+              <w:t>Satisfactory indicators established a default presumption that care was safe, which a concern had to overcome.</w:t>
+            </w:r>
+          </w:p>
+        </w:tc>
+        <w:tc>
+          <w:tcPr>
+            <w:tcW w:type="dxa" w:w="1080"/>
             <w:vMerge w:val="restart"/>
           </w:tcPr>
           <w:p>
@@ -2024,14 +1511,14 @@
       <w:tr>
         <w:tc>
           <w:tcPr>
-            <w:tcW w:type="dxa" w:w="2880"/>
+            <w:tcW w:type="dxa" w:w="1872"/>
             <w:vMerge/>
           </w:tcPr>
           <w:p/>
         </w:tc>
         <w:tc>
           <w:tcPr>
-            <w:tcW w:type="dxa" w:w="5328"/>
+            <w:tcW w:type="dxa" w:w="2736"/>
           </w:tcPr>
           <w:p>
             <w:r/>
@@ -2045,7 +1532,21 @@
         </w:tc>
         <w:tc>
           <w:tcPr>
-            <w:tcW w:type="dxa" w:w="1152"/>
+            <w:tcW w:type="dxa" w:w="3960"/>
+          </w:tcPr>
+          <w:p>
+            <w:r/>
+            <w:r>
+              <w:rPr>
+                <w:sz w:val="19"/>
+              </w:rPr>
+              <w:t>Indicators recorded past outcomes, whereas concerns described current processes and conditions; where both addressed the same domain, a reassuring result could prompt doubt.</w:t>
+            </w:r>
+          </w:p>
+        </w:tc>
+        <w:tc>
+          <w:tcPr>
+            <w:tcW w:type="dxa" w:w="1080"/>
             <w:vMerge/>
           </w:tcPr>
           <w:p/>
@@ -2054,14 +1555,14 @@
       <w:tr>
         <w:tc>
           <w:tcPr>
-            <w:tcW w:type="dxa" w:w="2880"/>
+            <w:tcW w:type="dxa" w:w="1872"/>
             <w:vMerge/>
           </w:tcPr>
           <w:p/>
         </w:tc>
         <w:tc>
           <w:tcPr>
-            <w:tcW w:type="dxa" w:w="5328"/>
+            <w:tcW w:type="dxa" w:w="2736"/>
           </w:tcPr>
           <w:p>
             <w:r/>
@@ -2075,7 +1576,21 @@
         </w:tc>
         <w:tc>
           <w:tcPr>
-            <w:tcW w:type="dxa" w:w="1152"/>
+            <w:tcW w:type="dxa" w:w="3960"/>
+          </w:tcPr>
+          <w:p>
+            <w:r/>
+            <w:r>
+              <w:rPr>
+                <w:sz w:val="19"/>
+              </w:rPr>
+              <w:t>Credibility depended on who raised the concern, how specific the account was and whether others said the same thing independently.</w:t>
+            </w:r>
+          </w:p>
+        </w:tc>
+        <w:tc>
+          <w:tcPr>
+            <w:tcW w:type="dxa" w:w="1080"/>
             <w:vMerge/>
           </w:tcPr>
           <w:p/>
@@ -2084,7 +1599,7 @@
       <w:tr>
         <w:tc>
           <w:tcPr>
-            <w:tcW w:type="dxa" w:w="2880"/>
+            <w:tcW w:type="dxa" w:w="1872"/>
             <w:vMerge w:val="restart"/>
           </w:tcPr>
           <w:p>
@@ -2099,7 +1614,7 @@
         </w:tc>
         <w:tc>
           <w:tcPr>
-            <w:tcW w:type="dxa" w:w="5328"/>
+            <w:tcW w:type="dxa" w:w="2736"/>
           </w:tcPr>
           <w:p>
             <w:r/>
@@ -2113,7 +1628,21 @@
         </w:tc>
         <w:tc>
           <w:tcPr>
-            <w:tcW w:type="dxa" w:w="1152"/>
+            <w:tcW w:type="dxa" w:w="3960"/>
+          </w:tcPr>
+          <w:p>
+            <w:r/>
+            <w:r>
+              <w:rPr>
+                <w:sz w:val="19"/>
+              </w:rPr>
+              <w:t>Managers asked nurses for written reports to make concerns visible to the organisation; this could also delay action.</w:t>
+            </w:r>
+          </w:p>
+        </w:tc>
+        <w:tc>
+          <w:tcPr>
+            <w:tcW w:type="dxa" w:w="1080"/>
             <w:vMerge w:val="restart"/>
           </w:tcPr>
           <w:p>
@@ -2133,14 +1662,14 @@
       <w:tr>
         <w:tc>
           <w:tcPr>
-            <w:tcW w:type="dxa" w:w="2880"/>
+            <w:tcW w:type="dxa" w:w="1872"/>
             <w:vMerge/>
           </w:tcPr>
           <w:p/>
         </w:tc>
         <w:tc>
           <w:tcPr>
-            <w:tcW w:type="dxa" w:w="5328"/>
+            <w:tcW w:type="dxa" w:w="2736"/>
           </w:tcPr>
           <w:p>
             <w:r/>
@@ -2154,7 +1683,21 @@
         </w:tc>
         <w:tc>
           <w:tcPr>
-            <w:tcW w:type="dxa" w:w="1152"/>
+            <w:tcW w:type="dxa" w:w="3960"/>
+          </w:tcPr>
+          <w:p>
+            <w:r/>
+            <w:r>
+              <w:rPr>
+                <w:sz w:val="19"/>
+              </w:rPr>
+              <w:t>Some managers gathered evidence themselves through observation and audit, often in their own time.</w:t>
+            </w:r>
+          </w:p>
+        </w:tc>
+        <w:tc>
+          <w:tcPr>
+            <w:tcW w:type="dxa" w:w="1080"/>
             <w:vMerge/>
           </w:tcPr>
           <w:p/>
@@ -2163,14 +1706,14 @@
       <w:tr>
         <w:tc>
           <w:tcPr>
-            <w:tcW w:type="dxa" w:w="2880"/>
+            <w:tcW w:type="dxa" w:w="1872"/>
             <w:vMerge/>
           </w:tcPr>
           <w:p/>
         </w:tc>
         <w:tc>
           <w:tcPr>
-            <w:tcW w:type="dxa" w:w="5328"/>
+            <w:tcW w:type="dxa" w:w="2736"/>
           </w:tcPr>
           <w:p>
             <w:r/>
@@ -2184,7 +1727,21 @@
         </w:tc>
         <w:tc>
           <w:tcPr>
-            <w:tcW w:type="dxa" w:w="1152"/>
+            <w:tcW w:type="dxa" w:w="3960"/>
+          </w:tcPr>
+          <w:p>
+            <w:r/>
+            <w:r>
+              <w:rPr>
+                <w:sz w:val="19"/>
+              </w:rPr>
+              <w:t>Managers’ requests reflected the evidence they expected senior managers and quality meetings to require, so demands passed down the hierarchy.</w:t>
+            </w:r>
+          </w:p>
+        </w:tc>
+        <w:tc>
+          <w:tcPr>
+            <w:tcW w:type="dxa" w:w="1080"/>
             <w:vMerge/>
           </w:tcPr>
           <w:p/>
@@ -2193,14 +1750,14 @@
       <w:tr>
         <w:tc>
           <w:tcPr>
-            <w:tcW w:type="dxa" w:w="2880"/>
+            <w:tcW w:type="dxa" w:w="1872"/>
             <w:vMerge/>
           </w:tcPr>
           <w:p/>
         </w:tc>
         <w:tc>
           <w:tcPr>
-            <w:tcW w:type="dxa" w:w="5328"/>
+            <w:tcW w:type="dxa" w:w="2736"/>
           </w:tcPr>
           <w:p>
             <w:r/>
@@ -2214,7 +1771,21 @@
         </w:tc>
         <w:tc>
           <w:tcPr>
-            <w:tcW w:type="dxa" w:w="1152"/>
+            <w:tcW w:type="dxa" w:w="3960"/>
+          </w:tcPr>
+          <w:p>
+            <w:r/>
+            <w:r>
+              <w:rPr>
+                <w:sz w:val="19"/>
+              </w:rPr>
+              <w:t>Concerns involving immediate clinical risk were acted on without substantiation; concerns with resource implications required a case.</w:t>
+            </w:r>
+          </w:p>
+        </w:tc>
+        <w:tc>
+          <w:tcPr>
+            <w:tcW w:type="dxa" w:w="1080"/>
             <w:vMerge/>
           </w:tcPr>
           <w:p/>
@@ -2223,7 +1794,7 @@
       <w:tr>
         <w:tc>
           <w:tcPr>
-            <w:tcW w:type="dxa" w:w="2880"/>
+            <w:tcW w:type="dxa" w:w="1872"/>
             <w:vMerge w:val="restart"/>
           </w:tcPr>
           <w:p>
@@ -2238,7 +1809,7 @@
         </w:tc>
         <w:tc>
           <w:tcPr>
-            <w:tcW w:type="dxa" w:w="5328"/>
+            <w:tcW w:type="dxa" w:w="2736"/>
           </w:tcPr>
           <w:p>
             <w:r/>
@@ -2252,7 +1823,21 @@
         </w:tc>
         <w:tc>
           <w:tcPr>
-            <w:tcW w:type="dxa" w:w="1152"/>
+            <w:tcW w:type="dxa" w:w="3960"/>
+          </w:tcPr>
+          <w:p>
+            <w:r/>
+            <w:r>
+              <w:rPr>
+                <w:sz w:val="19"/>
+              </w:rPr>
+              <w:t>Concerns were often resolved within the unit, which was quick but left no trace in organisational information.</w:t>
+            </w:r>
+          </w:p>
+        </w:tc>
+        <w:tc>
+          <w:tcPr>
+            <w:tcW w:type="dxa" w:w="1080"/>
             <w:vMerge w:val="restart"/>
           </w:tcPr>
           <w:p>
@@ -2272,14 +1857,14 @@
       <w:tr>
         <w:tc>
           <w:tcPr>
-            <w:tcW w:type="dxa" w:w="2880"/>
+            <w:tcW w:type="dxa" w:w="1872"/>
             <w:vMerge/>
           </w:tcPr>
           <w:p/>
         </w:tc>
         <w:tc>
           <w:tcPr>
-            <w:tcW w:type="dxa" w:w="5328"/>
+            <w:tcW w:type="dxa" w:w="2736"/>
           </w:tcPr>
           <w:p>
             <w:r/>
@@ -2293,7 +1878,21 @@
         </w:tc>
         <w:tc>
           <w:tcPr>
-            <w:tcW w:type="dxa" w:w="1152"/>
+            <w:tcW w:type="dxa" w:w="3960"/>
+          </w:tcPr>
+          <w:p>
+            <w:r/>
+            <w:r>
+              <w:rPr>
+                <w:sz w:val="19"/>
+              </w:rPr>
+              <w:t>Escalation required concerns to be reframed in measures senior managers recognised; some gained attention only after harm was counted.</w:t>
+            </w:r>
+          </w:p>
+        </w:tc>
+        <w:tc>
+          <w:tcPr>
+            <w:tcW w:type="dxa" w:w="1080"/>
             <w:vMerge/>
           </w:tcPr>
           <w:p/>
@@ -2302,14 +1901,14 @@
       <w:tr>
         <w:tc>
           <w:tcPr>
-            <w:tcW w:type="dxa" w:w="2880"/>
+            <w:tcW w:type="dxa" w:w="1872"/>
             <w:vMerge/>
           </w:tcPr>
           <w:p/>
         </w:tc>
         <w:tc>
           <w:tcPr>
-            <w:tcW w:type="dxa" w:w="5328"/>
+            <w:tcW w:type="dxa" w:w="2736"/>
           </w:tcPr>
           <w:p>
             <w:r/>
@@ -2323,7 +1922,21 @@
         </w:tc>
         <w:tc>
           <w:tcPr>
-            <w:tcW w:type="dxa" w:w="1152"/>
+            <w:tcW w:type="dxa" w:w="3960"/>
+          </w:tcPr>
+          <w:p>
+            <w:r/>
+            <w:r>
+              <w:rPr>
+                <w:sz w:val="19"/>
+              </w:rPr>
+              <w:t>Feedback to nurses was usually informal and unrecorded, and sometimes absent, with consequences for future speaking up.</w:t>
+            </w:r>
+          </w:p>
+        </w:tc>
+        <w:tc>
+          <w:tcPr>
+            <w:tcW w:type="dxa" w:w="1080"/>
             <w:vMerge/>
           </w:tcPr>
           <w:p/>
@@ -2332,7 +1945,7 @@
       <w:tr>
         <w:tc>
           <w:tcPr>
-            <w:tcW w:type="dxa" w:w="2880"/>
+            <w:tcW w:type="dxa" w:w="1872"/>
             <w:vMerge w:val="restart"/>
           </w:tcPr>
           <w:p>
@@ -2347,7 +1960,7 @@
         </w:tc>
         <w:tc>
           <w:tcPr>
-            <w:tcW w:type="dxa" w:w="5328"/>
+            <w:tcW w:type="dxa" w:w="2736"/>
           </w:tcPr>
           <w:p>
             <w:r/>
@@ -2361,7 +1974,21 @@
         </w:tc>
         <w:tc>
           <w:tcPr>
-            <w:tcW w:type="dxa" w:w="1152"/>
+            <w:tcW w:type="dxa" w:w="3960"/>
+          </w:tcPr>
+          <w:p>
+            <w:r/>
+            <w:r>
+              <w:rPr>
+                <w:sz w:val="19"/>
+              </w:rPr>
+              <w:t>Fixed, indicator-based agendas left no routine space for concerns that indicators did not capture.</w:t>
+            </w:r>
+          </w:p>
+        </w:tc>
+        <w:tc>
+          <w:tcPr>
+            <w:tcW w:type="dxa" w:w="1080"/>
             <w:vMerge w:val="restart"/>
           </w:tcPr>
           <w:p>
@@ -2381,14 +2008,14 @@
       <w:tr>
         <w:tc>
           <w:tcPr>
-            <w:tcW w:type="dxa" w:w="2880"/>
+            <w:tcW w:type="dxa" w:w="1872"/>
             <w:vMerge/>
           </w:tcPr>
           <w:p/>
         </w:tc>
         <w:tc>
           <w:tcPr>
-            <w:tcW w:type="dxa" w:w="5328"/>
+            <w:tcW w:type="dxa" w:w="2736"/>
           </w:tcPr>
           <w:p>
             <w:r/>
@@ -2402,7 +2029,21 @@
         </w:tc>
         <w:tc>
           <w:tcPr>
-            <w:tcW w:type="dxa" w:w="1152"/>
+            <w:tcW w:type="dxa" w:w="3960"/>
+          </w:tcPr>
+          <w:p>
+            <w:r/>
+            <w:r>
+              <w:rPr>
+                <w:sz w:val="19"/>
+              </w:rPr>
+              <w:t>Limited authority over staffing and budgets meant that any response with a cost required evidential justification.</w:t>
+            </w:r>
+          </w:p>
+        </w:tc>
+        <w:tc>
+          <w:tcPr>
+            <w:tcW w:type="dxa" w:w="1080"/>
             <w:vMerge/>
           </w:tcPr>
           <w:p/>
@@ -2411,14 +2052,14 @@
       <w:tr>
         <w:tc>
           <w:tcPr>
-            <w:tcW w:type="dxa" w:w="2880"/>
+            <w:tcW w:type="dxa" w:w="1872"/>
             <w:vMerge/>
           </w:tcPr>
           <w:p/>
         </w:tc>
         <w:tc>
           <w:tcPr>
-            <w:tcW w:type="dxa" w:w="5328"/>
+            <w:tcW w:type="dxa" w:w="2736"/>
           </w:tcPr>
           <w:p>
             <w:r/>
@@ -2432,7 +2073,21 @@
         </w:tc>
         <w:tc>
           <w:tcPr>
-            <w:tcW w:type="dxa" w:w="1152"/>
+            <w:tcW w:type="dxa" w:w="3960"/>
+          </w:tcPr>
+          <w:p>
+            <w:r/>
+            <w:r>
+              <w:rPr>
+                <w:sz w:val="19"/>
+              </w:rPr>
+              <w:t>Messaging applications and differences in communication style affected how concerns were raised, recorded and recognised.</w:t>
+            </w:r>
+          </w:p>
+        </w:tc>
+        <w:tc>
+          <w:tcPr>
+            <w:tcW w:type="dxa" w:w="1080"/>
             <w:vMerge/>
           </w:tcPr>
           <w:p/>
@@ -2477,7 +2132,7 @@
         <w:rPr>
           <w:b w:val="0"/>
         </w:rPr>
-        <w:t>Across hospitals, a run of satisfactory results shaped managers’ first reaction to a concern. Several described this presumption as inherited from senior managers rather than chosen, because it reflected what the organisation monitored most closely.</w:t>
+        <w:t>Across hospitals, a run of satisfactory results shaped managers’ first reaction to a concern. Several described this presumption as inherited from the organisation rather than chosen:</w:t>
       </w:r>
     </w:p>
     <w:p>
@@ -2496,6 +2151,14 @@
       </w:r>
     </w:p>
     <w:p>
+      <w:r>
+        <w:rPr>
+          <w:b w:val="0"/>
+        </w:rPr>
+        <w:t>The presumption is described here as organisational rather than personal. The manager’s starting point mirrored what senior managers monitored, so the dashboard defined what counted as normal before any concern was heard. The same presumption shaped how concerns on unrelated matters were first received:</w:t>
+      </w:r>
+    </w:p>
+    <w:p>
       <w:pPr>
         <w:spacing w:after="160"/>
         <w:ind w:left="720" w:right="576"/>
@@ -2508,6 +2171,14 @@
       </w:r>
       <w:r>
         <w:t>(P15, H4†)</w:t>
+      </w:r>
+    </w:p>
+    <w:p>
+      <w:r>
+        <w:rPr>
+          <w:b w:val="0"/>
+        </w:rPr>
+        <w:t>In this account, a favourable outcome indicator was set against a concern about supervision at night as though the two were directly comparable. The absence of falls was treated, at least initially, as an answer to a concern about risk. Daily exposure to the dashboard and the quality office’s attention to it reinforced its position as the default account of the unit:</w:t>
       </w:r>
     </w:p>
     <w:p>
@@ -2530,7 +2201,7 @@
         <w:rPr>
           <w:b w:val="0"/>
         </w:rPr>
-        <w:t>Managers with longer managerial experience more often described this presumption as something they had learned to resist. A green result could mean that harm had not yet happened rather than that care was adequate:</w:t>
+        <w:t>Not all managers accepted the presumption in the same way. Managers with longer managerial experience more often described having learned to treat a satisfactory result with caution:</w:t>
       </w:r>
     </w:p>
     <w:p>
@@ -2549,6 +2220,14 @@
       </w:r>
     </w:p>
     <w:p>
+      <w:r>
+        <w:rPr>
+          <w:b w:val="0"/>
+        </w:rPr>
+        <w:t>The distinction between nothing having happened and nothing happening suggests that the presumption of safety was learned within the organisation and could be revised through experience of problems that indicators had not anticipated. For less experienced managers, the presumption more often went unexamined until a concern challenged it.</w:t>
+      </w:r>
+    </w:p>
+    <w:p>
       <w:pPr>
         <w:pStyle w:val="Heading3"/>
       </w:pPr>
@@ -2561,7 +2240,7 @@
         <w:rPr>
           <w:b w:val="0"/>
         </w:rPr>
-        <w:t>In 15 of the 19 qualifying accounts, the indicator the manager cited did not measure the aspect or period of care the nurse was concerned about. Managers who recognised this gap described indicators as recording outcomes after harm had occurred, whereas nurses described the processes and conditions that came before it.</w:t>
+        <w:t>In 15 of the 19 qualifying accounts, the indicator the manager cited did not measure the aspect or period of care the nurse was concerned about. Managers who recognised this gap described the difference in terms of timing and content:</w:t>
       </w:r>
     </w:p>
     <w:p>
@@ -2580,6 +2259,14 @@
       </w:r>
     </w:p>
     <w:p>
+      <w:r>
+        <w:rPr>
+          <w:b w:val="0"/>
+        </w:rPr>
+        <w:t>The manager distinguished the time frame of the indicator from that of the concern. The nurse described a process failure in the present that the outcome indicator would register only once harm had occurred. In other accounts the gap concerned what was measured rather than when:</w:t>
+      </w:r>
+    </w:p>
+    <w:p>
       <w:pPr>
         <w:spacing w:after="160"/>
         <w:ind w:left="720" w:right="576"/>
@@ -2592,6 +2279,14 @@
       </w:r>
       <w:r>
         <w:t>(P17, H4†)</w:t>
+      </w:r>
+    </w:p>
+    <w:p>
+      <w:r>
+        <w:rPr>
+          <w:b w:val="0"/>
+        </w:rPr>
+        <w:t>Here the concern related to a practice, recorded but omitted observations, that no routine indicator was designed to capture. One manager summarised the temporal mismatch that many described:</w:t>
       </w:r>
     </w:p>
     <w:p>
@@ -2610,6 +2305,14 @@
       </w:r>
     </w:p>
     <w:p>
+      <w:r>
+        <w:rPr>
+          <w:b w:val="0"/>
+        </w:rPr>
+        <w:t>Patient-experience scores were described as particularly limited as a check on nurses’ concerns, because high satisfaction could reflect patients’ gratitude and short stays rather than the quality of care that nurses observed:</w:t>
+      </w:r>
+    </w:p>
+    <w:p>
       <w:pPr>
         <w:spacing w:after="160"/>
         <w:ind w:left="720" w:right="576"/>
@@ -2618,7 +2321,7 @@
         <w:rPr>
           <w:i/>
         </w:rPr>
-        <w:t xml:space="preserve">“Satisfaction was more than ninety percent. Mothers are grateful and they go home quickly; they do not complain. The nurse saw what the survey never asks about.” </w:t>
+        <w:t xml:space="preserve">“Satisfaction was more than ninety percent. [Patients] are grateful and they go home quickly; they do not complain. The nurse saw what the survey never asks about.” </w:t>
       </w:r>
       <w:r>
         <w:t>(P11, H3†)</w:t>
@@ -2629,7 +2332,7 @@
         <w:rPr>
           <w:b w:val="0"/>
         </w:rPr>
-        <w:t>Where the indicator and the concern addressed the same domain, a reassuring result could itself become a reason for doubt rather than confidence. One critical care manager described how a concern about repositioning made a run of zero pressure injuries appear implausible:</w:t>
+        <w:t>Where the indicator and the concern addressed the same domain, the relationship could reverse. In one of the four matched accounts, a satisfactory result became a reason for doubt rather than reassurance:</w:t>
       </w:r>
     </w:p>
     <w:p>
@@ -2648,6 +2351,14 @@
       </w:r>
     </w:p>
     <w:p>
+      <w:r>
+        <w:rPr>
+          <w:b w:val="0"/>
+        </w:rPr>
+        <w:t>Rather than weighing the concern against the indicator, this manager used the concern to question how the indicator data were produced. This form of active problem-sensing was uncommon in the accounts. Across the subtheme, recognising the gap between measure and concern did not by itself determine the response; it raised the question of what further information was needed, examined in Theme 2.</w:t>
+      </w:r>
+    </w:p>
+    <w:p>
       <w:pPr>
         <w:pStyle w:val="Heading3"/>
       </w:pPr>
@@ -2660,7 +2371,7 @@
         <w:rPr>
           <w:b w:val="0"/>
         </w:rPr>
-        <w:t>Managers judged credibility through the nurse raising the concern, the specificity of the account and whether others said the same thing independently. Concerns from experienced nurses who rarely complained, and concerns that named a time, patient situation or task, were more readily accepted.</w:t>
+        <w:t>Managers judged credibility through the nurse raising the concern, the specificity of the account and whether others said the same thing independently. The person raising the concern was often weighed as heavily as its content:</w:t>
       </w:r>
     </w:p>
     <w:p>
@@ -2679,6 +2390,14 @@
       </w:r>
     </w:p>
     <w:p>
+      <w:r>
+        <w:rPr>
+          <w:b w:val="0"/>
+        </w:rPr>
+        <w:t>A record of rarely complaining increased the weight given to a concern, whereas frequent complaining reduced it, which the manager acknowledged with some discomfort. Independent corroboration could also stand in for formal evidence:</w:t>
+      </w:r>
+    </w:p>
+    <w:p>
       <w:pPr>
         <w:spacing w:after="160"/>
         <w:ind w:left="720" w:right="576"/>
@@ -2691,6 +2410,14 @@
       </w:r>
       <w:r>
         <w:t>(P06, H2†)</w:t>
+      </w:r>
+    </w:p>
+    <w:p>
+      <w:r>
+        <w:rPr>
+          <w:b w:val="0"/>
+        </w:rPr>
+        <w:t>For this manager, agreement among nurses was sufficient substantiation, so that corroboration substituted for documentation. Specificity worked in a similar way, because it made a concern checkable:</w:t>
       </w:r>
     </w:p>
     <w:p>
@@ -2713,7 +2440,7 @@
         <w:rPr>
           <w:b w:val="0"/>
         </w:rPr>
-        <w:t>Some managers recognised that relying on the messenger could exclude nurses who raised concerns less often or less forcefully:</w:t>
+        <w:t>General statements about safety were difficult to act on, whereas a concrete event gave the manager something to verify. Some managers recognised that these criteria could disadvantage nurses who raised concerns less often or less forcefully:</w:t>
       </w:r>
     </w:p>
     <w:p>
@@ -2729,6 +2456,14 @@
       </w:r>
       <w:r>
         <w:t>(P01, H1†)</w:t>
+      </w:r>
+    </w:p>
+    <w:p>
+      <w:r>
+        <w:rPr>
+          <w:b w:val="0"/>
+        </w:rPr>
+        <w:t>This reflection identifies a limitation of judgements based on the messenger. Nurses who were newer, less confident or who expressed concerns tentatively, including some who had trained abroad (Section 3.7.3), may have had their concerns given less weight or may not have raised them at all.</w:t>
       </w:r>
     </w:p>
     <w:p>
@@ -2760,7 +2495,7 @@
         <w:rPr>
           <w:b w:val="0"/>
         </w:rPr>
-        <w:t>In 11 of the 19 qualifying accounts, managers asked the nurse for a written account or an incident report before acting. Documentation was raised spontaneously in early interviews, which led to the documentation probe added after interview 12. Managers presented documentation as a way of making the concern visible to the organisation rather than as a test of the nurse’s honesty, although nurses did not always experience it that way.</w:t>
+        <w:t>In 11 of the 19 qualifying accounts, managers asked the nurse for a written account or an incident report before acting. Documentation was raised spontaneously in early interviews, which led to the documentation probe added after interview 12. Managers presented documentation as a way of making a concern visible to the organisation:</w:t>
       </w:r>
     </w:p>
     <w:p>
@@ -2776,6 +2511,14 @@
       </w:r>
       <w:r>
         <w:t>(P10, H3)</w:t>
+      </w:r>
+    </w:p>
+    <w:p>
+      <w:r>
+        <w:rPr>
+          <w:b w:val="0"/>
+        </w:rPr>
+        <w:t>The manager framed documentation as a requirement of the quality system rather than a personal demand: an unreported concern had no existence in organisational information. Nurses did not always experience the request in this way:</w:t>
       </w:r>
     </w:p>
     <w:p>
@@ -2798,7 +2541,7 @@
         <w:rPr>
           <w:b w:val="0"/>
         </w:rPr>
-        <w:t>One manager acknowledged that requesting documentation could also delay a response:</w:t>
+        <w:t>This exchange shows the burden moving from manager to nurse. The nurse had already raised the concern verbally, and the request for writing reflected the manager’s anticipation of senior managers’ questions (Section 3.5.3) rather than doubt about the nurse’s account. One manager offered a contrasting account of why documentation was requested:</w:t>
       </w:r>
     </w:p>
     <w:p>
@@ -2817,6 +2560,14 @@
       </w:r>
     </w:p>
     <w:p>
+      <w:r>
+        <w:rPr>
+          <w:b w:val="0"/>
+        </w:rPr>
+        <w:t>This account is a negative case for the view that documentation only made concerns visible. Requesting documentation could also defer action, and whether that deferral mattered depended on whether the problem resolved before the report was written.</w:t>
+      </w:r>
+    </w:p>
+    <w:p>
       <w:pPr>
         <w:pStyle w:val="Heading3"/>
       </w:pPr>
@@ -2829,7 +2580,7 @@
         <w:rPr>
           <w:b w:val="0"/>
         </w:rPr>
-        <w:t>Other managers took responsibility for substantiation themselves. They visited the unit at night, audited records or worked alongside staff. This approach placed the investigative work on the manager rather than the nurse, but depended on the manager’s time and was often done outside working hours.</w:t>
+        <w:t>Other managers took responsibility for substantiation themselves by visiting the unit at night, auditing records or working alongside staff:</w:t>
       </w:r>
     </w:p>
     <w:p>
@@ -2848,6 +2599,14 @@
       </w:r>
     </w:p>
     <w:p>
+      <w:r>
+        <w:rPr>
+          <w:b w:val="0"/>
+        </w:rPr>
+        <w:t>By observing the night shift directly, the manager substantiated the concern without placing the burden on the nurse. Others produced evidence through audit:</w:t>
+      </w:r>
+    </w:p>
+    <w:p>
       <w:pPr>
         <w:spacing w:after="160"/>
         <w:ind w:left="720" w:right="576"/>
@@ -2860,6 +2619,14 @@
       </w:r>
       <w:r>
         <w:t>(P18, H5)</w:t>
+      </w:r>
+    </w:p>
+    <w:p>
+      <w:r>
+        <w:rPr>
+          <w:b w:val="0"/>
+        </w:rPr>
+        <w:t>Self-conducted audit produced evidence that could withstand challenge but relied on unpaid time, so the capacity to carry the burden was personal rather than organisational. Some managers described this as a matter of role:</w:t>
       </w:r>
     </w:p>
     <w:p>
@@ -2878,6 +2645,14 @@
       </w:r>
     </w:p>
     <w:p>
+      <w:r>
+        <w:rPr>
+          <w:b w:val="0"/>
+        </w:rPr>
+        <w:t>Managers who held this view described the nurse’s role as raising, not proving, concerns. Comparing these accounts with those in Section 3.5.1 suggests that whether managers asked nurses for evidence or gathered it themselves depended as much on available time as on a view of whose responsibility it was.</w:t>
+      </w:r>
+    </w:p>
+    <w:p>
       <w:pPr>
         <w:pStyle w:val="Heading3"/>
       </w:pPr>
@@ -2890,7 +2665,7 @@
         <w:rPr>
           <w:b w:val="0"/>
         </w:rPr>
-        <w:t>Managers’ expectations of nurses were shaped by what they expected senior managers and quality meetings to require. These expectations were described by managers with and without a qualifying incident, and several described how evidential demands passed down the hierarchy from the director to the nurse.</w:t>
+        <w:t>Managers’ expectations of nurses were shaped by what they expected senior managers and quality meetings to require. These expectations were described by managers with and without a qualifying incident:</w:t>
       </w:r>
     </w:p>
     <w:p>
@@ -2909,6 +2684,14 @@
       </w:r>
     </w:p>
     <w:p>
+      <w:r>
+        <w:rPr>
+          <w:b w:val="0"/>
+        </w:rPr>
+        <w:t>In this account, a satisfactory indicator closed discussion at the organisational level, so concerns without supporting data went no further. Managers described adapting to this expectation by reproducing it with their own staff:</w:t>
+      </w:r>
+    </w:p>
+    <w:p>
       <w:pPr>
         <w:spacing w:after="160"/>
         <w:ind w:left="720" w:right="576"/>
@@ -2921,6 +2704,14 @@
       </w:r>
       <w:r>
         <w:t>(P22, H6†)</w:t>
+      </w:r>
+    </w:p>
+    <w:p>
+      <w:r>
+        <w:rPr>
+          <w:b w:val="0"/>
+        </w:rPr>
+        <w:t>The evidence demanded of managers by directors was thus reproduced in what managers demanded of nurses. Earlier experiences of raising concerns without data could make this expectation lasting:</w:t>
       </w:r>
     </w:p>
     <w:p>
@@ -2939,6 +2730,14 @@
       </w:r>
     </w:p>
     <w:p>
+      <w:r>
+        <w:rPr>
+          <w:b w:val="0"/>
+        </w:rPr>
+        <w:t>Being dismissed once shaped later behaviour, showing how upward evidential demands were learned and then anticipated. Because these accounts came from managers with and without qualifying incidents and from several hospitals, anticipated demands appeared to be a general feature of the setting rather than specific to particular events.</w:t>
+      </w:r>
+    </w:p>
+    <w:p>
       <w:pPr>
         <w:pStyle w:val="Heading3"/>
       </w:pPr>
@@ -2951,7 +2750,7 @@
         <w:rPr>
           <w:b w:val="0"/>
         </w:rPr>
-        <w:t>Contrasting occasions showed that the burden of proof was not applied uniformly. Concerns involving immediate clinical risk, such as a patient who appeared to be deteriorating or a possible medication error, were usually acted on without further substantiation. Concerns about staffing, workload or patterns of practice more often required supporting evidence.</w:t>
+        <w:t>Contrasting occasions showed that the burden of proof was not applied uniformly. Concerns involving immediate clinical risk were usually acted on without further substantiation:</w:t>
       </w:r>
     </w:p>
     <w:p>
@@ -2970,6 +2769,14 @@
       </w:r>
     </w:p>
     <w:p>
+      <w:r>
+        <w:rPr>
+          <w:b w:val="0"/>
+        </w:rPr>
+        <w:t>The manager distinguished concerns about an individual patient’s condition, which prompted direct assessment, from concerns about staffing, which required a case. A similar distinction applied to medication safety:</w:t>
+      </w:r>
+    </w:p>
+    <w:p>
       <w:pPr>
         <w:spacing w:after="160"/>
         <w:ind w:left="720" w:right="576"/>
@@ -2978,7 +2785,7 @@
         <w:rPr>
           <w:i/>
         </w:rPr>
-        <w:t xml:space="preserve">“With children and medications, if she has a doubt, we stop and we double-check. I do not need anything else.” </w:t>
+        <w:t xml:space="preserve">“With [these patients] and medications, if she has a doubt, we stop and we double-check. I do not need anything else.” </w:t>
       </w:r>
       <w:r>
         <w:t>(P03, H1†)</w:t>
@@ -2989,7 +2796,7 @@
         <w:rPr>
           <w:b w:val="0"/>
         </w:rPr>
-        <w:t>Managers recognised the difference, although few described a rule for deciding which concerns required evidence. One manager described the line as falling between a single patient and the staffing of the unit:</w:t>
+        <w:t>Here a concern was accepted without substantiation because the cost of being wrong was immediate and serious. Stopping to check was itself a form of investigation, but one undertaken by the team at once rather than demanded from the nurse in advance. Few managers described an explicit rule for deciding which concerns required evidence, although one summarised the distinction:</w:t>
       </w:r>
     </w:p>
     <w:p>
@@ -3005,6 +2812,14 @@
       </w:r>
       <w:r>
         <w:t>(P16, H4)</w:t>
+      </w:r>
+    </w:p>
+    <w:p>
+      <w:r>
+        <w:rPr>
+          <w:b w:val="0"/>
+        </w:rPr>
+        <w:t>Taken together, these contrasting occasions indicate that the burden of proof attached less to how credible a concern was than to its consequences: concerns whose response would require changes to staffing or resources required stronger evidence.</w:t>
       </w:r>
     </w:p>
     <w:p>
@@ -3036,7 +2851,7 @@
         <w:rPr>
           <w:b w:val="0"/>
         </w:rPr>
-        <w:t>Most managers first tried to resolve concerns within their own authority by reallocating staff, changing assignments or adding checks. These responses were valued because they were fast. However, they left no trace in organisational information, so the indicator remained reassuring whether or not the underlying problem had been addressed.</w:t>
+        <w:t>Most managers first tried to resolve concerns within their own authority by reallocating staff, changing assignments or adding checks:</w:t>
       </w:r>
     </w:p>
     <w:p>
@@ -3055,6 +2870,14 @@
       </w:r>
     </w:p>
     <w:p>
+      <w:r>
+        <w:rPr>
+          <w:b w:val="0"/>
+        </w:rPr>
+        <w:t>Local adjustments resolved the immediate problem but bypassed organisational information. Because neither the concern nor the response was recorded, the dashboard continued to appear reassuring. Managers explained this preference by the slowness of formal routes:</w:t>
+      </w:r>
+    </w:p>
+    <w:p>
       <w:pPr>
         <w:spacing w:after="160"/>
         <w:ind w:left="720" w:right="576"/>
@@ -3070,6 +2893,14 @@
       </w:r>
     </w:p>
     <w:p>
+      <w:r>
+        <w:rPr>
+          <w:b w:val="0"/>
+        </w:rPr>
+        <w:t>Managers weighed the speed of an imperfect local fix against the uncertain outcome of formal processes. Local resolution therefore had a less visible cost: concerns managed within the unit did not inform organisational learning, and indicators remained an incomplete account of care.</w:t>
+      </w:r>
+    </w:p>
+    <w:p>
       <w:pPr>
         <w:pStyle w:val="Heading3"/>
       </w:pPr>
@@ -3082,7 +2913,7 @@
         <w:rPr>
           <w:b w:val="0"/>
         </w:rPr>
-        <w:t>When a concern exceeded their authority, managers described escalation as a process of translating the nurse’s account into measures that senior managers recognised, such as acuity scores, overtime hours or incident counts. Some described escalation succeeding only after harm had produced a number.</w:t>
+        <w:t>When a concern exceeded their authority, managers described escalation as translating the nurse’s account into measures that senior managers recognised:</w:t>
       </w:r>
     </w:p>
     <w:p>
@@ -3101,6 +2932,14 @@
       </w:r>
     </w:p>
     <w:p>
+      <w:r>
+        <w:rPr>
+          <w:b w:val="0"/>
+        </w:rPr>
+        <w:t>The manager reframed a concern about a care process in terms of workload and overtime, the measures senior managers used. Another manager described the same process through a metaphor:</w:t>
+      </w:r>
+    </w:p>
+    <w:p>
       <w:pPr>
         <w:spacing w:after="160"/>
         <w:ind w:left="720" w:right="576"/>
@@ -3113,6 +2952,14 @@
       </w:r>
       <w:r>
         <w:t>(P12, H3†)</w:t>
+      </w:r>
+    </w:p>
+    <w:p>
+      <w:r>
+        <w:rPr>
+          <w:b w:val="0"/>
+        </w:rPr>
+        <w:t>The idea of ‘dressing’ the concern conveys that its content did not change, but its form had to match what the organisation recognised. Some managers described the limits of this translation:</w:t>
       </w:r>
     </w:p>
     <w:p>
@@ -3131,6 +2978,14 @@
       </w:r>
     </w:p>
     <w:p>
+      <w:r>
+        <w:rPr>
+          <w:b w:val="0"/>
+        </w:rPr>
+        <w:t>Here a concern without a corresponding measure gained attention only after harm had occurred and been counted, which was the outcome the original concern had sought to prevent. This account illustrates most clearly how reliance on indicators could delay a response to concerns that indicators did not capture.</w:t>
+      </w:r>
+    </w:p>
+    <w:p>
       <w:pPr>
         <w:pStyle w:val="Heading3"/>
       </w:pPr>
@@ -3143,7 +2998,7 @@
         <w:rPr>
           <w:b w:val="0"/>
         </w:rPr>
-        <w:t>Feedback to the nurse who raised the concern was rarely formal or recorded. Preliminary analysis interpreted this as an absence of feedback. Member reflection refined this interpretation: participants described feedback that was frequent but informal and not recorded, given in passing conversation, so neither the nurse nor the organisation could easily see it. Managers also described occasions when no feedback was given and recognised the consequences for whether nurses would raise concerns again.</w:t>
+        <w:t>Feedback to the nurse who raised the concern was rarely formal or recorded. Preliminary analysis interpreted this as an absence of feedback. Member reflection refined this interpretation: participants described feedback that was frequent but informal, given in passing conversation and not recorded, so neither the nurse nor the organisation could easily see it.</w:t>
       </w:r>
     </w:p>
     <w:p>
@@ -3162,6 +3017,14 @@
       </w:r>
     </w:p>
     <w:p>
+      <w:r>
+        <w:rPr>
+          <w:b w:val="0"/>
+        </w:rPr>
+        <w:t>Feedback was given but not formalised, and the manager assumed the nurse understood the link between the concern and the change. Other managers acknowledged that feedback did not always happen:</w:t>
+      </w:r>
+    </w:p>
+    <w:p>
       <w:pPr>
         <w:spacing w:after="160"/>
         <w:ind w:left="720" w:right="576"/>
@@ -3177,6 +3040,14 @@
       </w:r>
     </w:p>
     <w:p>
+      <w:r>
+        <w:rPr>
+          <w:b w:val="0"/>
+        </w:rPr>
+        <w:t>Without explicit feedback, nurses could see a change, or the absence of one, without knowing whether their concern had contributed. Managers linked this directly to whether nurses would speak up again:</w:t>
+      </w:r>
+    </w:p>
+    <w:p>
       <w:pPr>
         <w:spacing w:after="160"/>
         <w:ind w:left="720" w:right="576"/>
@@ -3189,6 +3060,14 @@
       </w:r>
       <w:r>
         <w:t>(P11, H3†)</w:t>
+      </w:r>
+    </w:p>
+    <w:p>
+      <w:r>
+        <w:rPr>
+          <w:b w:val="0"/>
+        </w:rPr>
+        <w:t>Because informal follow-up depended on memory and opportunity, it varied between managers and between shifts. Managers recognised its importance for future reporting but described no routine for ensuring that it happened.</w:t>
       </w:r>
     </w:p>
     <w:p>
@@ -3220,7 +3099,7 @@
         <w:rPr>
           <w:b w:val="0"/>
         </w:rPr>
-        <w:t>Quality meetings followed fixed agendas organised around indicator results. Managers described no regular space for concerns that indicators did not capture, and said accreditation preparation intensified the focus on indicators.</w:t>
+        <w:t>Managers in all six hospitals described quality meetings that followed fixed agendas organised around indicator results, consistent with their shared regional governance:</w:t>
       </w:r>
     </w:p>
     <w:p>
@@ -3239,6 +3118,14 @@
       </w:r>
     </w:p>
     <w:p>
+      <w:r>
+        <w:rPr>
+          <w:b w:val="0"/>
+        </w:rPr>
+        <w:t>The structure of the meeting determined what could be discussed. Concerns without a corresponding indicator had no agenda item and so no routine route into organisational decision-making. Accreditation preparation intensified this focus:</w:t>
+      </w:r>
+    </w:p>
+    <w:p>
       <w:pPr>
         <w:spacing w:after="160"/>
         <w:ind w:left="720" w:right="576"/>
@@ -3254,6 +3141,14 @@
       </w:r>
     </w:p>
     <w:p>
+      <w:r>
+        <w:rPr>
+          <w:b w:val="0"/>
+        </w:rPr>
+        <w:t>The periods of greatest organisational attention to quality were therefore also those in which indicators most dominated discussion, leaving least room for concerns that indicators did not reflect.</w:t>
+      </w:r>
+    </w:p>
+    <w:p>
       <w:pPr>
         <w:pStyle w:val="Heading3"/>
       </w:pPr>
@@ -3266,7 +3161,7 @@
         <w:rPr>
           <w:b w:val="0"/>
         </w:rPr>
-        <w:t>Managers’ authority usually ended at the duty roster. Any response that required additional staff, overtime or equipment had to be justified to others, so the evidential demands attached to resources were passed on to the concern itself. This pattern was described in both tertiary and secondary hospitals.</w:t>
+        <w:t>Managers’ authority usually ended at the duty roster. Any response that required additional staff, overtime or equipment had to be justified to others:</w:t>
       </w:r>
     </w:p>
     <w:p>
@@ -3285,6 +3180,14 @@
       </w:r>
     </w:p>
     <w:p>
+      <w:r>
+        <w:rPr>
+          <w:b w:val="0"/>
+        </w:rPr>
+        <w:t>The evidential demand attached to resources was transferred to the concern: because any response with a cost needed justification, so did the concern that prompted it. This boundary was described in both tertiary and secondary hospitals:</w:t>
+      </w:r>
+    </w:p>
+    <w:p>
       <w:pPr>
         <w:spacing w:after="160"/>
         <w:ind w:left="720" w:right="576"/>
@@ -3300,6 +3203,14 @@
       </w:r>
     </w:p>
     <w:p>
+      <w:r>
+        <w:rPr>
+          <w:b w:val="0"/>
+        </w:rPr>
+        <w:t>The roster marked the limit of managerial discretion. Within it, managers could act on judgement; beyond it, they needed a case. This helps explain the pattern in Section 3.5.4, where concerns with resource implications required stronger evidence than those about individual patients.</w:t>
+      </w:r>
+    </w:p>
+    <w:p>
       <w:pPr>
         <w:pStyle w:val="Heading3"/>
       </w:pPr>
@@ -3312,7 +3223,7 @@
         <w:rPr>
           <w:b w:val="0"/>
         </w:rPr>
-        <w:t>Managers interviewed after the informal-channels probe was introduced described messaging applications as a common route for concerns, particularly at night. Such messages were fast but left no record that could be used in formal processes, so managers treated them as information rather than as reports. Managers also described differences in how nurses from different educational backgrounds raised concerns, which affected how easily concerns were recognised.</w:t>
+        <w:t>Managers interviewed after the informal-channels probe was introduced described messaging applications as a common route for concerns, particularly at night:</w:t>
       </w:r>
     </w:p>
     <w:p>
@@ -3331,6 +3242,14 @@
       </w:r>
     </w:p>
     <w:p>
+      <w:r>
+        <w:rPr>
+          <w:b w:val="0"/>
+        </w:rPr>
+        <w:t>Messaging applications made it quicker to raise concerns but reduced their evidential weight, because messages left no record usable in formal processes. Managers responded by asking nurses to convert messages into formal reports:</w:t>
+      </w:r>
+    </w:p>
+    <w:p>
       <w:pPr>
         <w:spacing w:after="160"/>
         <w:ind w:left="720" w:right="576"/>
@@ -3346,6 +3265,14 @@
       </w:r>
     </w:p>
     <w:p>
+      <w:r>
+        <w:rPr>
+          <w:b w:val="0"/>
+        </w:rPr>
+        <w:t>Informal channels therefore added a step in which the burden of documentation returned to the nurse. Managers also described differences in how nurses from different educational backgrounds raised concerns:</w:t>
+      </w:r>
+    </w:p>
+    <w:p>
       <w:pPr>
         <w:spacing w:after="160"/>
         <w:ind w:left="720" w:right="576"/>
@@ -3358,6 +3285,14 @@
       </w:r>
       <w:r>
         <w:t>(P18, H5)</w:t>
+      </w:r>
+    </w:p>
+    <w:p>
+      <w:r>
+        <w:rPr>
+          <w:b w:val="0"/>
+        </w:rPr>
+        <w:t>Recognising a concern could therefore depend on the manager’s attention to how it was expressed. Concerns raised tentatively risked being missed or given less weight, which connects this subtheme to the reliance on the messenger described in Section 3.4.3.</w:t>
       </w:r>
     </w:p>
     <w:p>

</xml_diff>

<commit_message>
Results: limit claims to reported accounts; add scope statement on care outcomes
Co-Authored-By: Claude Opus 5.5 <noreply@anthropic.com>
Claude-Session: https://claude.ai/code/session_01UT78gMGbZSf9MGjAKTYAmX
</commit_message>
<xml_diff>
--- a/docs/revision_R2/Findings_Section.docx
+++ b/docs/revision_R2/Findings_Section.docx
@@ -1355,7 +1355,7 @@
         <w:rPr>
           <w:b w:val="0"/>
         </w:rPr>
-        <w:t>Quotations are attributed by participant and hospital code; † indicates a quotation translated from Arabic. Words in square brackets were added to clarify meaning or replaced to protect anonymity.</w:t>
+        <w:t>Quotations are attributed by participant and hospital code; † indicates a quotation translated from Arabic. Words in square brackets were added to clarify meaning or replaced to protect anonymity. The findings describe managers’ reported judgements and responses. They do not establish whether concerns were well founded, whether indicator results were accurate or whether reported responses changed care or patient outcomes.</w:t>
       </w:r>
     </w:p>
     <w:p>
@@ -1831,7 +1831,7 @@
               <w:rPr>
                 <w:sz w:val="19"/>
               </w:rPr>
-              <w:t>Concerns were often resolved within the unit, which was quick but left no trace in organisational information.</w:t>
+              <w:t>Managers described resolving many concerns within the unit, which was quick but left no trace in organisational information.</w:t>
             </w:r>
           </w:p>
         </w:tc>
@@ -2286,7 +2286,7 @@
         <w:rPr>
           <w:b w:val="0"/>
         </w:rPr>
-        <w:t>Here the concern related to a practice, recorded but omitted observations, that no routine indicator was designed to capture. One manager summarised the temporal mismatch that many described:</w:t>
+        <w:t>Here the concern, as the manager reported it, related to a practice, observations recorded but not performed, that no routine indicator was designed to capture. One manager summarised the temporal mismatch that many described:</w:t>
       </w:r>
     </w:p>
     <w:p>
@@ -2564,7 +2564,7 @@
         <w:rPr>
           <w:b w:val="0"/>
         </w:rPr>
-        <w:t>This account is a negative case for the view that documentation only made concerns visible. Requesting documentation could also defer action, and whether that deferral mattered depended on whether the problem resolved before the report was written.</w:t>
+        <w:t>This account is a negative case for the view that documentation only made concerns visible. Requesting documentation could also defer action; in the manager’s account, the consequences of that deferral depended on whether the problem resolved before the report was written.</w:t>
       </w:r>
     </w:p>
     <w:p>
@@ -2874,7 +2874,7 @@
         <w:rPr>
           <w:b w:val="0"/>
         </w:rPr>
-        <w:t>Local adjustments resolved the immediate problem but bypassed organisational information. Because neither the concern nor the response was recorded, the dashboard continued to appear reassuring. Managers explained this preference by the slowness of formal routes:</w:t>
+        <w:t>Managers presented local adjustments as resolving the immediate problem, although this could not be verified. These adjustments bypassed organisational information: because neither the concern nor the response was recorded, the dashboard continued to appear reassuring. Managers explained this preference by the slowness of formal routes:</w:t>
       </w:r>
     </w:p>
     <w:p>
@@ -2897,7 +2897,7 @@
         <w:rPr>
           <w:b w:val="0"/>
         </w:rPr>
-        <w:t>Managers weighed the speed of an imperfect local fix against the uncertain outcome of formal processes. Local resolution therefore had a less visible cost: concerns managed within the unit did not inform organisational learning, and indicators remained an incomplete account of care.</w:t>
+        <w:t>Managers weighed the speed of an imperfect local fix against the uncertain outcome of formal processes. Local resolution therefore had a less visible cost: as managers described it, concerns managed within the unit did not reach organisational processes for learning, and indicators remained an incomplete account of care.</w:t>
       </w:r>
     </w:p>
     <w:p>
@@ -2982,7 +2982,7 @@
         <w:rPr>
           <w:b w:val="0"/>
         </w:rPr>
-        <w:t>Here a concern without a corresponding measure gained attention only after harm had occurred and been counted, which was the outcome the original concern had sought to prevent. This account illustrates most clearly how reliance on indicators could delay a response to concerns that indicators did not capture.</w:t>
+        <w:t>In this account, a concern without a corresponding measure gained senior attention only after a fall had been recorded, the kind of event the original concern had sought to prevent. The study cannot establish whether the earlier concern would have prevented the fall, but the account illustrates how reliance on indicators could delay a response to concerns that indicators did not capture.</w:t>
       </w:r>
     </w:p>
     <w:p>
@@ -3308,7 +3308,7 @@
         <w:rPr>
           <w:b w:val="0"/>
         </w:rPr>
-        <w:t>Taken together, the findings show that the burden of proof for nurses’ concerns was conditional and moved between people. Reassuring indicators created a presumption of safety, and a concern had to overcome it. Concerns involving immediate clinical risk were generally accepted without further substantiation. Concerns about staffing, workload or patterns of care, which indicators rarely measured, required evidence. Managers either asked nurses to provide that evidence or gathered it themselves, depending largely on their own capacity. Much of what was required reflected managers’ anticipation of what senior managers and quality meetings would ask for, so evidential demands passed down the hierarchy. Local responses resolved many concerns but left indicators unchanged, and feedback to nurses was mostly informal. These patterns are drawn together in the Discussion as a practice framework for assessing concerns alongside indicators, which has not been tested.</w:t>
+        <w:t>Taken together, the findings show that the burden of proof for nurses’ concerns was conditional and moved between people. Reassuring indicators created a presumption of safety, and a concern had to overcome it. Concerns involving immediate clinical risk were generally accepted without further substantiation. Concerns about staffing, workload or patterns of care, which indicators rarely measured, required evidence. Managers either asked nurses to provide that evidence or gathered it themselves, depending largely on their own capacity. Much of what was required reflected managers’ anticipation of what senior managers and quality meetings would ask for, so evidential demands passed down the hierarchy. Managers described local responses as resolving many concerns while leaving indicators unchanged, and feedback to nurses was mostly informal. These patterns are drawn together in the Discussion as a practice framework for assessing concerns alongside indicators, which has not been tested.</w:t>
       </w:r>
     </w:p>
     <w:sectPr>

</xml_diff>